<commit_message>
feat(rp05): update docs with CrowdSec + Suricata + nftables
Fiche-RP05-ANDREO-Vincent.docx :
- Snort remplace par Suricata (IDS/IPS multi-thread)
- UFW/Fail2ban remplace par nftables + CrowdSec (IPS collaboratif)
- Ressources logicielles et descriptif mis a jour

Presentation-5min-RP05-ANDREO-Vincent.docx :
- Refonte en texte pur (sans tableaux ni couleurs)
- Structure 5 min : contexte / audit / pfSense / durcissement / pentests

Co-authored-by: Copilot <223556219+Copilot@users.noreply.github.com>
</commit_message>
<xml_diff>
--- a/Présentation-5min-RP05-ANDREO-Vincent.docx
+++ b/Présentation-5min-RP05-ANDREO-Vincent.docx
@@ -4,21 +4,20 @@
   <w:body>
     <w:p>
       <w:pPr>
-        <w:spacing w:before="0" w:after="40"/>
+        <w:spacing w:before="0" w:after="80"/>
         <w:jc w:val="center"/>
       </w:pPr>
       <w:r>
         <w:rPr>
           <w:b/>
-          <w:color w:val="1A2B3C"/>
-          <w:sz w:val="40"/>
+          <w:sz w:val="30"/>
         </w:rPr>
-        <w:t>RP-05 — Auditer et Securiser l'Infrastructure IRIS Nice</w:t>
+        <w:t>RP-05 — Auditer et Sécuriser l'Infrastructure IRIS Nice</w:t>
       </w:r>
     </w:p>
     <w:p>
       <w:pPr>
-        <w:spacing w:after="80"/>
+        <w:spacing w:after="40"/>
         <w:jc w:val="center"/>
       </w:pPr>
       <w:r>
@@ -26,1879 +25,556 @@
           <w:color w:val="555555"/>
           <w:sz w:val="20"/>
         </w:rPr>
-        <w:t>BTS SIO SISR  |  ANDREO Vincent  |  IRIS Nice  |  Mars 2026  |  Presentation 5 minutes</w:t>
+        <w:t>BTS SIO SISR  ·  ANDREO Vincent  ·  IRIS Nice  ·  Mars 2026</w:t>
       </w:r>
     </w:p>
     <w:p>
       <w:pPr>
-        <w:spacing w:before="0" w:after="0"/>
-        <w:pBdr>
-          <w:bottom w:val="single" w:sz="6" w:space="1" w:color="1a2b3c"/>
-        </w:pBdr>
-      </w:pPr>
-    </w:p>
-    <w:p>
-      <w:pPr>
-        <w:spacing w:before="120" w:after="60"/>
+        <w:spacing w:after="320"/>
+        <w:jc w:val="center"/>
       </w:pPr>
       <w:r>
         <w:rPr>
           <w:b/>
-          <w:color w:val="1A2B3C"/>
-          <w:sz w:val="24"/>
+          <w:sz w:val="20"/>
         </w:rPr>
-        <w:t>Apercu de la mission</w:t>
+        <w:t>Présentation orale — 5 minutes</w:t>
       </w:r>
-    </w:p>
-    <w:tbl>
-      <w:tblPr>
-        <w:tblStyle w:val="TableGrid"/>
-        <w:tblW w:type="auto" w:w="0"/>
-        <w:tblLook w:firstColumn="1" w:firstRow="1" w:lastColumn="0" w:lastRow="0" w:noHBand="0" w:noVBand="1" w:val="04A0"/>
-      </w:tblPr>
-      <w:tblGrid>
-        <w:gridCol w:w="2493"/>
-        <w:gridCol w:w="2493"/>
-        <w:gridCol w:w="2493"/>
-        <w:gridCol w:w="2493"/>
-      </w:tblGrid>
-      <w:tr>
-        <w:tc>
-          <w:tcPr>
-            <w:tcW w:type="dxa" w:w="2493"/>
-            <w:shd w:val="clear" w:color="auto" w:fill="1a2b3c"/>
-          </w:tcPr>
-          <w:p>
-            <w:r>
-              <w:rPr>
-                <w:b/>
-                <w:color w:val="FFFFFF"/>
-                <w:sz w:val="18"/>
-              </w:rPr>
-              <w:t>Mission</w:t>
-            </w:r>
-          </w:p>
-        </w:tc>
-        <w:tc>
-          <w:tcPr>
-            <w:tcW w:type="dxa" w:w="2493"/>
-            <w:shd w:val="clear" w:color="auto" w:fill="1a2b3c"/>
-          </w:tcPr>
-          <w:p>
-            <w:r>
-              <w:rPr>
-                <w:b/>
-                <w:color w:val="FFFFFF"/>
-                <w:sz w:val="18"/>
-              </w:rPr>
-              <w:t>Perimetre</w:t>
-            </w:r>
-          </w:p>
-        </w:tc>
-        <w:tc>
-          <w:tcPr>
-            <w:tcW w:type="dxa" w:w="2493"/>
-            <w:shd w:val="clear" w:color="auto" w:fill="1a2b3c"/>
-          </w:tcPr>
-          <w:p>
-            <w:r>
-              <w:rPr>
-                <w:b/>
-                <w:color w:val="FFFFFF"/>
-                <w:sz w:val="18"/>
-              </w:rPr>
-              <w:t>Duree</w:t>
-            </w:r>
-          </w:p>
-        </w:tc>
-        <w:tc>
-          <w:tcPr>
-            <w:tcW w:type="dxa" w:w="2493"/>
-            <w:shd w:val="clear" w:color="auto" w:fill="1a2b3c"/>
-          </w:tcPr>
-          <w:p>
-            <w:r>
-              <w:rPr>
-                <w:b/>
-                <w:color w:val="FFFFFF"/>
-                <w:sz w:val="18"/>
-              </w:rPr>
-              <w:t>Resultat</w:t>
-            </w:r>
-          </w:p>
-        </w:tc>
-      </w:tr>
-      <w:tr>
-        <w:tc>
-          <w:tcPr>
-            <w:tcW w:type="dxa" w:w="2493"/>
-          </w:tcPr>
-          <w:p>
-            <w:r>
-              <w:rPr>
-                <w:sz w:val="18"/>
-              </w:rPr>
-              <w:t>Audit + securisation complete</w:t>
-            </w:r>
-          </w:p>
-        </w:tc>
-        <w:tc>
-          <w:tcPr>
-            <w:tcW w:type="dxa" w:w="2493"/>
-          </w:tcPr>
-          <w:p>
-            <w:r>
-              <w:rPr>
-                <w:sz w:val="18"/>
-              </w:rPr>
-              <w:t>4 VLANs - 6 equipements</w:t>
-            </w:r>
-          </w:p>
-        </w:tc>
-        <w:tc>
-          <w:tcPr>
-            <w:tcW w:type="dxa" w:w="2493"/>
-          </w:tcPr>
-          <w:p>
-            <w:r>
-              <w:rPr>
-                <w:sz w:val="18"/>
-              </w:rPr>
-              <w:t>6 semaines</w:t>
-            </w:r>
-          </w:p>
-        </w:tc>
-        <w:tc>
-          <w:tcPr>
-            <w:tcW w:type="dxa" w:w="2493"/>
-          </w:tcPr>
-          <w:p>
-            <w:r>
-              <w:rPr>
-                <w:sz w:val="18"/>
-              </w:rPr>
-              <w:t>8 failles crit. -&gt; 0</w:t>
-            </w:r>
-          </w:p>
-        </w:tc>
-      </w:tr>
-    </w:tbl>
-    <w:p>
-      <w:pPr>
-        <w:spacing w:after="40"/>
-      </w:pPr>
     </w:p>
     <w:p>
       <w:pPr>
-        <w:spacing w:before="0" w:after="0"/>
-        <w:pBdr>
-          <w:bottom w:val="single" w:sz="6" w:space="1" w:color="1a2b3c"/>
-        </w:pBdr>
-      </w:pPr>
-    </w:p>
-    <w:p>
-      <w:pPr>
-        <w:spacing w:before="160" w:after="60"/>
+        <w:spacing w:before="280" w:after="80"/>
       </w:pPr>
       <w:r>
         <w:rPr>
           <w:b/>
-          <w:color w:val="C75000"/>
-          <w:sz w:val="26"/>
+          <w:sz w:val="24"/>
+          <w:u w:val="single"/>
         </w:rPr>
-        <w:t>PARTIE 1 - Contexte  [~1 min]</w:t>
+        <w:t>Partie 1 — Contexte  (~1 minute)</w:t>
       </w:r>
     </w:p>
     <w:p>
       <w:pPr>
-        <w:spacing w:before="40" w:after="40"/>
+        <w:spacing w:before="40" w:after="60"/>
       </w:pPr>
       <w:r>
         <w:rPr>
-          <w:b w:val="0"/>
-          <w:sz w:val="21"/>
+          <w:sz w:val="22"/>
         </w:rPr>
-        <w:t>L'infrastructure IRIS Nice (RP-01 a RP-04, 2020-2025) n'avait jamais fait l'objet d'un audit de securite.</w:t>
-      </w:r>
-    </w:p>
-    <w:tbl>
-      <w:tblPr>
-        <w:tblStyle w:val="TableGrid"/>
-        <w:tblW w:type="auto" w:w="0"/>
-        <w:tblLook w:firstColumn="1" w:firstRow="1" w:lastColumn="0" w:lastRow="0" w:noHBand="0" w:noVBand="1" w:val="04A0"/>
-      </w:tblPr>
-      <w:tblGrid>
-        <w:gridCol w:w="4986"/>
-        <w:gridCol w:w="4986"/>
-      </w:tblGrid>
-      <w:tr>
-        <w:tc>
-          <w:tcPr>
-            <w:tcW w:type="dxa" w:w="4986"/>
-            <w:shd w:val="clear" w:color="auto" w:fill="8b1a1a"/>
-          </w:tcPr>
-          <w:p>
-            <w:r>
-              <w:rPr>
-                <w:b/>
-                <w:color w:val="FFFFFF"/>
-                <w:sz w:val="18"/>
-              </w:rPr>
-              <w:t>Probleme identifie</w:t>
-            </w:r>
-          </w:p>
-        </w:tc>
-        <w:tc>
-          <w:tcPr>
-            <w:tcW w:type="dxa" w:w="4986"/>
-            <w:shd w:val="clear" w:color="auto" w:fill="8b1a1a"/>
-          </w:tcPr>
-          <w:p>
-            <w:r>
-              <w:rPr>
-                <w:b/>
-                <w:color w:val="FFFFFF"/>
-                <w:sz w:val="18"/>
-              </w:rPr>
-              <w:t>Risque immediat</w:t>
-            </w:r>
-          </w:p>
-        </w:tc>
-      </w:tr>
-      <w:tr>
-        <w:tc>
-          <w:tcPr>
-            <w:tcW w:type="dxa" w:w="4986"/>
-          </w:tcPr>
-          <w:p>
-            <w:r>
-              <w:rPr>
-                <w:sz w:val="18"/>
-              </w:rPr>
-              <w:t>Aucun pare-feu dedie</w:t>
-            </w:r>
-          </w:p>
-        </w:tc>
-        <w:tc>
-          <w:tcPr>
-            <w:tcW w:type="dxa" w:w="4986"/>
-          </w:tcPr>
-          <w:p>
-            <w:r>
-              <w:rPr>
-                <w:sz w:val="18"/>
-              </w:rPr>
-              <w:t>Tout le trafic reseau non filtre</w:t>
-            </w:r>
-          </w:p>
-        </w:tc>
-      </w:tr>
-      <w:tr>
-        <w:tc>
-          <w:tcPr>
-            <w:tcW w:type="dxa" w:w="4986"/>
-            <w:shd w:val="clear" w:color="auto" w:fill="fdf0f0"/>
-          </w:tcPr>
-          <w:p>
-            <w:r>
-              <w:rPr>
-                <w:sz w:val="18"/>
-              </w:rPr>
-              <w:t>Aucune DMZ</w:t>
-            </w:r>
-          </w:p>
-        </w:tc>
-        <w:tc>
-          <w:tcPr>
-            <w:tcW w:type="dxa" w:w="4986"/>
-            <w:shd w:val="clear" w:color="auto" w:fill="fdf0f0"/>
-          </w:tcPr>
-          <w:p>
-            <w:r>
-              <w:rPr>
-                <w:sz w:val="18"/>
-              </w:rPr>
-              <w:t>Services exposes directement sur le LAN interne</w:t>
-            </w:r>
-          </w:p>
-        </w:tc>
-      </w:tr>
-      <w:tr>
-        <w:tc>
-          <w:tcPr>
-            <w:tcW w:type="dxa" w:w="4986"/>
-          </w:tcPr>
-          <w:p>
-            <w:r>
-              <w:rPr>
-                <w:sz w:val="18"/>
-              </w:rPr>
-              <w:t>SMBv1 + Telnet actifs</w:t>
-            </w:r>
-          </w:p>
-        </w:tc>
-        <w:tc>
-          <w:tcPr>
-            <w:tcW w:type="dxa" w:w="4986"/>
-          </w:tcPr>
-          <w:p>
-            <w:r>
-              <w:rPr>
-                <w:sz w:val="18"/>
-              </w:rPr>
-              <w:t>EternalBlue CVSS 9.8 - prise de controle totale possible</w:t>
-            </w:r>
-          </w:p>
-        </w:tc>
-      </w:tr>
-      <w:tr>
-        <w:tc>
-          <w:tcPr>
-            <w:tcW w:type="dxa" w:w="4986"/>
-            <w:shd w:val="clear" w:color="auto" w:fill="fdf0f0"/>
-          </w:tcPr>
-          <w:p>
-            <w:r>
-              <w:rPr>
-                <w:sz w:val="18"/>
-              </w:rPr>
-              <w:t>OS jamais durcis</w:t>
-            </w:r>
-          </w:p>
-        </w:tc>
-        <w:tc>
-          <w:tcPr>
-            <w:tcW w:type="dxa" w:w="4986"/>
-            <w:shd w:val="clear" w:color="auto" w:fill="fdf0f0"/>
-          </w:tcPr>
-          <w:p>
-            <w:r>
-              <w:rPr>
-                <w:sz w:val="18"/>
-              </w:rPr>
-              <w:t>CIS-CAT Windows 41,7 %  -  Lynis Linux 58/100</w:t>
-            </w:r>
-          </w:p>
-        </w:tc>
-      </w:tr>
-      <w:tr>
-        <w:tc>
-          <w:tcPr>
-            <w:tcW w:type="dxa" w:w="4986"/>
-          </w:tcPr>
-          <w:p>
-            <w:r>
-              <w:rPr>
-                <w:sz w:val="18"/>
-              </w:rPr>
-              <w:t>Aucune matrice de risques</w:t>
-            </w:r>
-          </w:p>
-        </w:tc>
-        <w:tc>
-          <w:tcPr>
-            <w:tcW w:type="dxa" w:w="4986"/>
-          </w:tcPr>
-          <w:p>
-            <w:r>
-              <w:rPr>
-                <w:sz w:val="18"/>
-              </w:rPr>
-              <w:t>Impossible de prioriser les corrections</w:t>
-            </w:r>
-          </w:p>
-        </w:tc>
-      </w:tr>
-    </w:tbl>
-    <w:p>
-      <w:pPr>
-        <w:spacing w:before="0" w:after="0"/>
-        <w:pBdr>
-          <w:bottom w:val="single" w:sz="6" w:space="1" w:color="1a2b3c"/>
-        </w:pBdr>
-      </w:pPr>
-    </w:p>
-    <w:p>
-      <w:pPr>
-        <w:spacing w:before="160" w:after="60"/>
-      </w:pPr>
-      <w:r>
-        <w:rPr>
-          <w:b/>
-          <w:color w:val="C75000"/>
-          <w:sz w:val="26"/>
-        </w:rPr>
-        <w:t>PARTIE 2 - Phase 1 : Audit  [~1 min]</w:t>
+        <w:t>L'infrastructure IRIS Nice a été déployée entre 2020 et 2026 dans le cadre des RP-01 à RP-04 : réseau Cisco multi-VLANs, Active Directory, hyperviseur KVM et supervision Grafana. Malgré plusieurs années de fonctionnement, aucun audit de sécurité n'avait jamais été réalisé.</w:t>
       </w:r>
     </w:p>
     <w:p>
       <w:pPr>
-        <w:spacing w:before="40" w:after="40"/>
+        <w:spacing w:before="40" w:after="60"/>
       </w:pPr>
       <w:r>
         <w:rPr>
-          <w:b w:val="0"/>
-          <w:sz w:val="21"/>
+          <w:sz w:val="22"/>
         </w:rPr>
-        <w:t>5 outils open source utilises pour identifier 38 CVE dont 8 critiques :</w:t>
-      </w:r>
-    </w:p>
-    <w:tbl>
-      <w:tblPr>
-        <w:tblStyle w:val="TableGrid"/>
-        <w:tblW w:type="auto" w:w="0"/>
-        <w:tblLook w:firstColumn="1" w:firstRow="1" w:lastColumn="0" w:lastRow="0" w:noHBand="0" w:noVBand="1" w:val="04A0"/>
-      </w:tblPr>
-      <w:tblGrid>
-        <w:gridCol w:w="3324"/>
-        <w:gridCol w:w="3324"/>
-        <w:gridCol w:w="3324"/>
-      </w:tblGrid>
-      <w:tr>
-        <w:tc>
-          <w:tcPr>
-            <w:tcW w:type="dxa" w:w="3324"/>
-            <w:shd w:val="clear" w:color="auto" w:fill="1a2b3c"/>
-          </w:tcPr>
-          <w:p>
-            <w:r>
-              <w:rPr>
-                <w:b/>
-                <w:color w:val="FFFFFF"/>
-                <w:sz w:val="18"/>
-              </w:rPr>
-              <w:t>Outil</w:t>
-            </w:r>
-          </w:p>
-        </w:tc>
-        <w:tc>
-          <w:tcPr>
-            <w:tcW w:type="dxa" w:w="3324"/>
-            <w:shd w:val="clear" w:color="auto" w:fill="1a2b3c"/>
-          </w:tcPr>
-          <w:p>
-            <w:r>
-              <w:rPr>
-                <w:b/>
-                <w:color w:val="FFFFFF"/>
-                <w:sz w:val="18"/>
-              </w:rPr>
-              <w:t>Ce qu'il fait</w:t>
-            </w:r>
-          </w:p>
-        </w:tc>
-        <w:tc>
-          <w:tcPr>
-            <w:tcW w:type="dxa" w:w="3324"/>
-            <w:shd w:val="clear" w:color="auto" w:fill="1a2b3c"/>
-          </w:tcPr>
-          <w:p>
-            <w:r>
-              <w:rPr>
-                <w:b/>
-                <w:color w:val="FFFFFF"/>
-                <w:sz w:val="18"/>
-              </w:rPr>
-              <w:t>Resultat obtenu</w:t>
-            </w:r>
-          </w:p>
-        </w:tc>
-      </w:tr>
-      <w:tr>
-        <w:tc>
-          <w:tcPr>
-            <w:tcW w:type="dxa" w:w="3324"/>
-          </w:tcPr>
-          <w:p>
-            <w:r>
-              <w:rPr>
-                <w:sz w:val="18"/>
-              </w:rPr>
-              <w:t>Nmap 7.94</w:t>
-            </w:r>
-          </w:p>
-        </w:tc>
-        <w:tc>
-          <w:tcPr>
-            <w:tcW w:type="dxa" w:w="3324"/>
-          </w:tcPr>
-          <w:p>
-            <w:r>
-              <w:rPr>
-                <w:sz w:val="18"/>
-              </w:rPr>
-              <w:t>Scan des ports et services</w:t>
-            </w:r>
-          </w:p>
-        </w:tc>
-        <w:tc>
-          <w:tcPr>
-            <w:tcW w:type="dxa" w:w="3324"/>
-          </w:tcPr>
-          <w:p>
-            <w:r>
-              <w:rPr>
-                <w:sz w:val="18"/>
-              </w:rPr>
-              <w:t>847 ports ouverts recenses</w:t>
-            </w:r>
-          </w:p>
-        </w:tc>
-      </w:tr>
-      <w:tr>
-        <w:tc>
-          <w:tcPr>
-            <w:tcW w:type="dxa" w:w="3324"/>
-            <w:shd w:val="clear" w:color="auto" w:fill="f2f2f2"/>
-          </w:tcPr>
-          <w:p>
-            <w:r>
-              <w:rPr>
-                <w:sz w:val="18"/>
-              </w:rPr>
-              <w:t>OpenVAS / Greenbone</w:t>
-            </w:r>
-          </w:p>
-        </w:tc>
-        <w:tc>
-          <w:tcPr>
-            <w:tcW w:type="dxa" w:w="3324"/>
-            <w:shd w:val="clear" w:color="auto" w:fill="f2f2f2"/>
-          </w:tcPr>
-          <w:p>
-            <w:r>
-              <w:rPr>
-                <w:sz w:val="18"/>
-              </w:rPr>
-              <w:t>Recherche de CVE connues</w:t>
-            </w:r>
-          </w:p>
-        </w:tc>
-        <w:tc>
-          <w:tcPr>
-            <w:tcW w:type="dxa" w:w="3324"/>
-            <w:shd w:val="clear" w:color="auto" w:fill="f2f2f2"/>
-          </w:tcPr>
-          <w:p>
-            <w:r>
-              <w:rPr>
-                <w:sz w:val="18"/>
-              </w:rPr>
-              <w:t>38 CVE - 8 critiques : EternalBlue + Log4Shell</w:t>
-            </w:r>
-          </w:p>
-        </w:tc>
-      </w:tr>
-      <w:tr>
-        <w:tc>
-          <w:tcPr>
-            <w:tcW w:type="dxa" w:w="3324"/>
-          </w:tcPr>
-          <w:p>
-            <w:r>
-              <w:rPr>
-                <w:sz w:val="18"/>
-              </w:rPr>
-              <w:t>Lynis 3.0</w:t>
-            </w:r>
-          </w:p>
-        </w:tc>
-        <w:tc>
-          <w:tcPr>
-            <w:tcW w:type="dxa" w:w="3324"/>
-          </w:tcPr>
-          <w:p>
-            <w:r>
-              <w:rPr>
-                <w:sz w:val="18"/>
-              </w:rPr>
-              <w:t>Audit durcissement Linux</w:t>
-            </w:r>
-          </w:p>
-        </w:tc>
-        <w:tc>
-          <w:tcPr>
-            <w:tcW w:type="dxa" w:w="3324"/>
-          </w:tcPr>
-          <w:p>
-            <w:r>
-              <w:rPr>
-                <w:sz w:val="18"/>
-              </w:rPr>
-              <w:t>Score : 58/100</w:t>
-            </w:r>
-          </w:p>
-        </w:tc>
-      </w:tr>
-      <w:tr>
-        <w:tc>
-          <w:tcPr>
-            <w:tcW w:type="dxa" w:w="3324"/>
-            <w:shd w:val="clear" w:color="auto" w:fill="f2f2f2"/>
-          </w:tcPr>
-          <w:p>
-            <w:r>
-              <w:rPr>
-                <w:sz w:val="18"/>
-              </w:rPr>
-              <w:t>CIS-CAT Lite</w:t>
-            </w:r>
-          </w:p>
-        </w:tc>
-        <w:tc>
-          <w:tcPr>
-            <w:tcW w:type="dxa" w:w="3324"/>
-            <w:shd w:val="clear" w:color="auto" w:fill="f2f2f2"/>
-          </w:tcPr>
-          <w:p>
-            <w:r>
-              <w:rPr>
-                <w:sz w:val="18"/>
-              </w:rPr>
-              <w:t>Conformite Windows CIS</w:t>
-            </w:r>
-          </w:p>
-        </w:tc>
-        <w:tc>
-          <w:tcPr>
-            <w:tcW w:type="dxa" w:w="3324"/>
-            <w:shd w:val="clear" w:color="auto" w:fill="f2f2f2"/>
-          </w:tcPr>
-          <w:p>
-            <w:r>
-              <w:rPr>
-                <w:sz w:val="18"/>
-              </w:rPr>
-              <w:t>Conformite : 41,7 %</w:t>
-            </w:r>
-          </w:p>
-        </w:tc>
-      </w:tr>
-      <w:tr>
-        <w:tc>
-          <w:tcPr>
-            <w:tcW w:type="dxa" w:w="3324"/>
-          </w:tcPr>
-          <w:p>
-            <w:r>
-              <w:rPr>
-                <w:sz w:val="18"/>
-              </w:rPr>
-              <w:t>Wapiti 3.1</w:t>
-            </w:r>
-          </w:p>
-        </w:tc>
-        <w:tc>
-          <w:tcPr>
-            <w:tcW w:type="dxa" w:w="3324"/>
-          </w:tcPr>
-          <w:p>
-            <w:r>
-              <w:rPr>
-                <w:sz w:val="18"/>
-              </w:rPr>
-              <w:t>Failles web OWASP Top 10</w:t>
-            </w:r>
-          </w:p>
-        </w:tc>
-        <w:tc>
-          <w:tcPr>
-            <w:tcW w:type="dxa" w:w="3324"/>
-          </w:tcPr>
-          <w:p>
-            <w:r>
-              <w:rPr>
-                <w:sz w:val="18"/>
-              </w:rPr>
-              <w:t>6 failles web identifiees</w:t>
-            </w:r>
-          </w:p>
-        </w:tc>
-      </w:tr>
-    </w:tbl>
-    <w:p>
-      <w:pPr>
-        <w:spacing w:before="80" w:after="40"/>
-      </w:pPr>
-      <w:r>
-        <w:rPr>
-          <w:b/>
-          <w:color w:val="8B1A1A"/>
-          <w:sz w:val="21"/>
-        </w:rPr>
-        <w:t>Top 3 risques critiques : EternalBlue CVSS 9.8  -  Log4Shell CVSS 10.0  -  Telnet Cisco CVSS 9.1</w:t>
-      </w:r>
-    </w:p>
-    <w:p>
-      <w:pPr>
-        <w:spacing w:before="0" w:after="0"/>
-        <w:pBdr>
-          <w:bottom w:val="single" w:sz="6" w:space="1" w:color="1a2b3c"/>
-        </w:pBdr>
-      </w:pPr>
-    </w:p>
-    <w:p>
-      <w:pPr>
-        <w:spacing w:before="160" w:after="60"/>
-      </w:pPr>
-      <w:r>
-        <w:rPr>
-          <w:b/>
-          <w:color w:val="C75000"/>
-          <w:sz w:val="26"/>
-        </w:rPr>
-        <w:t>PARTIE 3 - Phase 2 : pfSense + DMZ  [~1 min]</w:t>
-      </w:r>
-    </w:p>
-    <w:p>
-      <w:pPr>
-        <w:spacing w:before="40" w:after="40"/>
-      </w:pPr>
-      <w:r>
-        <w:rPr>
-          <w:b w:val="0"/>
-          <w:sz w:val="21"/>
-        </w:rPr>
-        <w:t>Deploiement d'un pare-feu pfSense 2.7 avec architecture deny-all et creation d'une DMZ isolee :</w:t>
-      </w:r>
-    </w:p>
-    <w:p>
-      <w:pPr>
-        <w:pStyle w:val="ListBullet"/>
-        <w:spacing w:before="20" w:after="20"/>
-      </w:pPr>
-      <w:r>
-        <w:rPr>
-          <w:sz w:val="21"/>
-        </w:rPr>
-        <w:t>Politique deny-all par defaut - chaque regle est explicite et documentee</w:t>
-      </w:r>
-    </w:p>
-    <w:p>
-      <w:pPr>
-        <w:pStyle w:val="ListBullet"/>
-        <w:spacing w:before="20" w:after="20"/>
-      </w:pPr>
-      <w:r>
-        <w:rPr>
-          <w:sz w:val="21"/>
-        </w:rPr>
-        <w:t>DMZ 172.16.0.0/24 totalement isolee du LAN interne (segmentation complete)</w:t>
-      </w:r>
-    </w:p>
-    <w:p>
-      <w:pPr>
-        <w:pStyle w:val="ListBullet"/>
-        <w:spacing w:before="20" w:after="20"/>
-      </w:pPr>
-      <w:r>
-        <w:rPr>
-          <w:sz w:val="21"/>
-        </w:rPr>
-        <w:t>IDS/IPS Snort actif sur interface WAN - detection d'attaques en temps reel</w:t>
-      </w:r>
-    </w:p>
-    <w:p>
-      <w:pPr>
-        <w:pStyle w:val="ListBullet"/>
-        <w:spacing w:before="20" w:after="20"/>
-      </w:pPr>
-      <w:r>
-        <w:rPr>
-          <w:sz w:val="21"/>
-        </w:rPr>
-        <w:t>Meme si un serveur web est compromis, le pirate reste bloque en DMZ</w:t>
-      </w:r>
-    </w:p>
-    <w:p>
-      <w:pPr>
-        <w:spacing w:before="0" w:after="0"/>
-        <w:pBdr>
-          <w:bottom w:val="single" w:sz="6" w:space="1" w:color="1a2b3c"/>
-        </w:pBdr>
-      </w:pPr>
-    </w:p>
-    <w:p>
-      <w:pPr>
-        <w:spacing w:before="160" w:after="60"/>
-      </w:pPr>
-      <w:r>
-        <w:rPr>
-          <w:b/>
-          <w:color w:val="C75000"/>
-          <w:sz w:val="26"/>
-        </w:rPr>
-        <w:t>PARTIE 4 - Phase 3 : Durcissement Linux + Windows  [~1 min]</w:t>
-      </w:r>
-    </w:p>
-    <w:tbl>
-      <w:tblPr>
-        <w:tblStyle w:val="TableGrid"/>
-        <w:tblW w:type="auto" w:w="0"/>
-        <w:tblLook w:firstColumn="1" w:firstRow="1" w:lastColumn="0" w:lastRow="0" w:noHBand="0" w:noVBand="1" w:val="04A0"/>
-      </w:tblPr>
-      <w:tblGrid>
-        <w:gridCol w:w="2493"/>
-        <w:gridCol w:w="2493"/>
-        <w:gridCol w:w="2493"/>
-        <w:gridCol w:w="2493"/>
-      </w:tblGrid>
-      <w:tr>
-        <w:tc>
-          <w:tcPr>
-            <w:tcW w:type="dxa" w:w="2493"/>
-            <w:shd w:val="clear" w:color="auto" w:fill="1a2b3c"/>
-          </w:tcPr>
-          <w:p>
-            <w:r>
-              <w:rPr>
-                <w:b/>
-                <w:color w:val="FFFFFF"/>
-                <w:sz w:val="18"/>
-              </w:rPr>
-              <w:t>Systeme</w:t>
-            </w:r>
-          </w:p>
-        </w:tc>
-        <w:tc>
-          <w:tcPr>
-            <w:tcW w:type="dxa" w:w="2493"/>
-            <w:shd w:val="clear" w:color="auto" w:fill="1a2b3c"/>
-          </w:tcPr>
-          <w:p>
-            <w:r>
-              <w:rPr>
-                <w:b/>
-                <w:color w:val="FFFFFF"/>
-                <w:sz w:val="18"/>
-              </w:rPr>
-              <w:t>Score avant</w:t>
-            </w:r>
-          </w:p>
-        </w:tc>
-        <w:tc>
-          <w:tcPr>
-            <w:tcW w:type="dxa" w:w="2493"/>
-            <w:shd w:val="clear" w:color="auto" w:fill="1a2b3c"/>
-          </w:tcPr>
-          <w:p>
-            <w:r>
-              <w:rPr>
-                <w:b/>
-                <w:color w:val="FFFFFF"/>
-                <w:sz w:val="18"/>
-              </w:rPr>
-              <w:t>Score apres</w:t>
-            </w:r>
-          </w:p>
-        </w:tc>
-        <w:tc>
-          <w:tcPr>
-            <w:tcW w:type="dxa" w:w="2493"/>
-            <w:shd w:val="clear" w:color="auto" w:fill="1a2b3c"/>
-          </w:tcPr>
-          <w:p>
-            <w:r>
-              <w:rPr>
-                <w:b/>
-                <w:color w:val="FFFFFF"/>
-                <w:sz w:val="18"/>
-              </w:rPr>
-              <w:t>Gain</w:t>
-            </w:r>
-          </w:p>
-        </w:tc>
-      </w:tr>
-      <w:tr>
-        <w:tc>
-          <w:tcPr>
-            <w:tcW w:type="dxa" w:w="2493"/>
-          </w:tcPr>
-          <w:p>
-            <w:r>
-              <w:rPr>
-                <w:sz w:val="18"/>
-              </w:rPr>
-              <w:t>Linux - Lynis</w:t>
-            </w:r>
-          </w:p>
-        </w:tc>
-        <w:tc>
-          <w:tcPr>
-            <w:tcW w:type="dxa" w:w="2493"/>
-          </w:tcPr>
-          <w:p>
-            <w:r>
-              <w:rPr>
-                <w:sz w:val="18"/>
-              </w:rPr>
-              <w:t>58/100</w:t>
-            </w:r>
-          </w:p>
-        </w:tc>
-        <w:tc>
-          <w:tcPr>
-            <w:tcW w:type="dxa" w:w="2493"/>
-          </w:tcPr>
-          <w:p>
-            <w:r>
-              <w:rPr>
-                <w:sz w:val="18"/>
-              </w:rPr>
-              <w:t>79/100</w:t>
-            </w:r>
-          </w:p>
-        </w:tc>
-        <w:tc>
-          <w:tcPr>
-            <w:tcW w:type="dxa" w:w="2493"/>
-          </w:tcPr>
-          <w:p>
-            <w:r>
-              <w:rPr>
-                <w:sz w:val="18"/>
-              </w:rPr>
-              <w:t>+21 pts</w:t>
-            </w:r>
-          </w:p>
-        </w:tc>
-      </w:tr>
-      <w:tr>
-        <w:tc>
-          <w:tcPr>
-            <w:tcW w:type="dxa" w:w="2493"/>
-            <w:shd w:val="clear" w:color="auto" w:fill="f2f2f2"/>
-          </w:tcPr>
-          <w:p>
-            <w:r>
-              <w:rPr>
-                <w:sz w:val="18"/>
-              </w:rPr>
-              <w:t>Windows - CIS-CAT</w:t>
-            </w:r>
-          </w:p>
-        </w:tc>
-        <w:tc>
-          <w:tcPr>
-            <w:tcW w:type="dxa" w:w="2493"/>
-            <w:shd w:val="clear" w:color="auto" w:fill="f2f2f2"/>
-          </w:tcPr>
-          <w:p>
-            <w:r>
-              <w:rPr>
-                <w:sz w:val="18"/>
-              </w:rPr>
-              <w:t>41,7 %</w:t>
-            </w:r>
-          </w:p>
-        </w:tc>
-        <w:tc>
-          <w:tcPr>
-            <w:tcW w:type="dxa" w:w="2493"/>
-            <w:shd w:val="clear" w:color="auto" w:fill="f2f2f2"/>
-          </w:tcPr>
-          <w:p>
-            <w:r>
-              <w:rPr>
-                <w:sz w:val="18"/>
-              </w:rPr>
-              <w:t>82 %</w:t>
-            </w:r>
-          </w:p>
-        </w:tc>
-        <w:tc>
-          <w:tcPr>
-            <w:tcW w:type="dxa" w:w="2493"/>
-            <w:shd w:val="clear" w:color="auto" w:fill="f2f2f2"/>
-          </w:tcPr>
-          <w:p>
-            <w:r>
-              <w:rPr>
-                <w:sz w:val="18"/>
-              </w:rPr>
-              <w:t>+40 pts</w:t>
-            </w:r>
-          </w:p>
-        </w:tc>
-      </w:tr>
-    </w:tbl>
-    <w:p>
-      <w:pPr>
-        <w:spacing w:before="80" w:after="40"/>
-      </w:pPr>
-      <w:r>
-        <w:rPr>
-          <w:b w:val="0"/>
-          <w:sz w:val="20"/>
-        </w:rPr>
-        <w:t>Linux : SSH PermitRootLogin=no - UFW deny-all - Fail2ban (3 essais -&gt; ban) - auditd - services inutiles desactives</w:t>
+        <w:t>Cinq problèmes critiques ont été identifiés avant même de commencer l'audit :</w:t>
       </w:r>
     </w:p>
     <w:p>
       <w:pPr>
         <w:spacing w:before="20" w:after="40"/>
+        <w:ind w:left="400"/>
       </w:pPr>
       <w:r>
         <w:rPr>
-          <w:b w:val="0"/>
-          <w:sz w:val="20"/>
+          <w:sz w:val="22"/>
         </w:rPr>
-        <w:t>Windows : SMBv1 desactive - LLMNR desactive - Credential Guard - LAPS - 12 GPOs ANSSI</w:t>
+        <w:t>–  Aucun pare-feu dédié — tout le trafic réseau circule sans filtrage.</w:t>
       </w:r>
     </w:p>
     <w:p>
       <w:pPr>
-        <w:spacing w:before="0" w:after="0"/>
-        <w:pBdr>
-          <w:bottom w:val="single" w:sz="6" w:space="1" w:color="1a2b3c"/>
-        </w:pBdr>
+        <w:spacing w:before="20" w:after="40"/>
+        <w:ind w:left="400"/>
       </w:pPr>
+      <w:r>
+        <w:rPr>
+          <w:sz w:val="22"/>
+        </w:rPr>
+        <w:t>–  Aucune DMZ — les services sont directement exposés sur le LAN interne.</w:t>
+      </w:r>
     </w:p>
     <w:p>
       <w:pPr>
-        <w:spacing w:before="160" w:after="60"/>
+        <w:spacing w:before="20" w:after="40"/>
+        <w:ind w:left="400"/>
+      </w:pPr>
+      <w:r>
+        <w:rPr>
+          <w:sz w:val="22"/>
+        </w:rPr>
+        <w:t>–  SMBv1 et Telnet actifs — la faille EternalBlue (CVSS 9.8) est exploitable à distance.</w:t>
+      </w:r>
+    </w:p>
+    <w:p>
+      <w:pPr>
+        <w:spacing w:before="20" w:after="40"/>
+        <w:ind w:left="400"/>
+      </w:pPr>
+      <w:r>
+        <w:rPr>
+          <w:sz w:val="22"/>
+        </w:rPr>
+        <w:t>–  Systèmes jamais durcis — CIS-CAT Windows à 41,7 % et Lynis Linux à 58/100.</w:t>
+      </w:r>
+    </w:p>
+    <w:p>
+      <w:pPr>
+        <w:spacing w:before="20" w:after="40"/>
+        <w:ind w:left="400"/>
+      </w:pPr>
+      <w:r>
+        <w:rPr>
+          <w:sz w:val="22"/>
+        </w:rPr>
+        <w:t>–  Aucune matrice de risques — impossible de prioriser les corrections.</w:t>
+      </w:r>
+    </w:p>
+    <w:p>
+      <w:pPr>
+        <w:spacing w:before="280" w:after="80"/>
       </w:pPr>
       <w:r>
         <w:rPr>
           <w:b/>
-          <w:color w:val="C75000"/>
-          <w:sz w:val="26"/>
+          <w:sz w:val="24"/>
+          <w:u w:val="single"/>
         </w:rPr>
-        <w:t>PARTIE 5 - Phase 4 : Pentests + Bilan  [~1 min]</w:t>
+        <w:t>Partie 2 — Phase 1 : Audit de sécurité  (~1 minute)</w:t>
       </w:r>
     </w:p>
-    <w:tbl>
-      <w:tblPr>
-        <w:tblStyle w:val="TableGrid"/>
-        <w:tblW w:type="auto" w:w="0"/>
-        <w:tblLook w:firstColumn="1" w:firstRow="1" w:lastColumn="0" w:lastRow="0" w:noHBand="0" w:noVBand="1" w:val="04A0"/>
-      </w:tblPr>
-      <w:tblGrid>
-        <w:gridCol w:w="3324"/>
-        <w:gridCol w:w="3324"/>
-        <w:gridCol w:w="3324"/>
-      </w:tblGrid>
-      <w:tr>
-        <w:tc>
-          <w:tcPr>
-            <w:tcW w:type="dxa" w:w="3324"/>
-            <w:shd w:val="clear" w:color="auto" w:fill="1a2b3c"/>
-          </w:tcPr>
-          <w:p>
-            <w:r>
-              <w:rPr>
-                <w:b/>
-                <w:color w:val="FFFFFF"/>
-                <w:sz w:val="18"/>
-              </w:rPr>
-              <w:t>Test</w:t>
-            </w:r>
-          </w:p>
-        </w:tc>
-        <w:tc>
-          <w:tcPr>
-            <w:tcW w:type="dxa" w:w="3324"/>
-            <w:shd w:val="clear" w:color="auto" w:fill="1a2b3c"/>
-          </w:tcPr>
-          <w:p>
-            <w:r>
-              <w:rPr>
-                <w:b/>
-                <w:color w:val="FFFFFF"/>
-                <w:sz w:val="18"/>
-              </w:rPr>
-              <w:t>Outil</w:t>
-            </w:r>
-          </w:p>
-        </w:tc>
-        <w:tc>
-          <w:tcPr>
-            <w:tcW w:type="dxa" w:w="3324"/>
-            <w:shd w:val="clear" w:color="auto" w:fill="1a2b3c"/>
-          </w:tcPr>
-          <w:p>
-            <w:r>
-              <w:rPr>
-                <w:b/>
-                <w:color w:val="FFFFFF"/>
-                <w:sz w:val="18"/>
-              </w:rPr>
-              <w:t>Resultat</w:t>
-            </w:r>
-          </w:p>
-        </w:tc>
-      </w:tr>
-      <w:tr>
-        <w:tc>
-          <w:tcPr>
-            <w:tcW w:type="dxa" w:w="3324"/>
-          </w:tcPr>
-          <w:p>
-            <w:r>
-              <w:rPr>
-                <w:sz w:val="18"/>
-              </w:rPr>
-              <w:t>EternalBlue / SMBv1</w:t>
-            </w:r>
-          </w:p>
-        </w:tc>
-        <w:tc>
-          <w:tcPr>
-            <w:tcW w:type="dxa" w:w="3324"/>
-          </w:tcPr>
-          <w:p>
-            <w:r>
-              <w:rPr>
-                <w:sz w:val="18"/>
-              </w:rPr>
-              <w:t>Metasploit</w:t>
-            </w:r>
-          </w:p>
-        </w:tc>
-        <w:tc>
-          <w:tcPr>
-            <w:tcW w:type="dxa" w:w="3324"/>
-          </w:tcPr>
-          <w:p>
-            <w:r>
-              <w:rPr>
-                <w:sz w:val="18"/>
-              </w:rPr>
-              <w:t>PASS - SMBv1 desactive</w:t>
-            </w:r>
-          </w:p>
-        </w:tc>
-      </w:tr>
-      <w:tr>
-        <w:tc>
-          <w:tcPr>
-            <w:tcW w:type="dxa" w:w="3324"/>
-            <w:shd w:val="clear" w:color="auto" w:fill="f2f2f2"/>
-          </w:tcPr>
-          <w:p>
-            <w:r>
-              <w:rPr>
-                <w:sz w:val="18"/>
-              </w:rPr>
-              <w:t>Brute force SSH</w:t>
-            </w:r>
-          </w:p>
-        </w:tc>
-        <w:tc>
-          <w:tcPr>
-            <w:tcW w:type="dxa" w:w="3324"/>
-            <w:shd w:val="clear" w:color="auto" w:fill="f2f2f2"/>
-          </w:tcPr>
-          <w:p>
-            <w:r>
-              <w:rPr>
-                <w:sz w:val="18"/>
-              </w:rPr>
-              <w:t>Hydra</w:t>
-            </w:r>
-          </w:p>
-        </w:tc>
-        <w:tc>
-          <w:tcPr>
-            <w:tcW w:type="dxa" w:w="3324"/>
-            <w:shd w:val="clear" w:color="auto" w:fill="f2f2f2"/>
-          </w:tcPr>
-          <w:p>
-            <w:r>
-              <w:rPr>
-                <w:sz w:val="18"/>
-              </w:rPr>
-              <w:t>PASS - Fail2ban bloque a J+3</w:t>
-            </w:r>
-          </w:p>
-        </w:tc>
-      </w:tr>
-      <w:tr>
-        <w:tc>
-          <w:tcPr>
-            <w:tcW w:type="dxa" w:w="3324"/>
-          </w:tcPr>
-          <w:p>
-            <w:r>
-              <w:rPr>
-                <w:sz w:val="18"/>
-              </w:rPr>
-              <w:t>Pass-the-Hash Windows</w:t>
-            </w:r>
-          </w:p>
-        </w:tc>
-        <w:tc>
-          <w:tcPr>
-            <w:tcW w:type="dxa" w:w="3324"/>
-          </w:tcPr>
-          <w:p>
-            <w:r>
-              <w:rPr>
-                <w:sz w:val="18"/>
-              </w:rPr>
-              <w:t>Mimikatz</w:t>
-            </w:r>
-          </w:p>
-        </w:tc>
-        <w:tc>
-          <w:tcPr>
-            <w:tcW w:type="dxa" w:w="3324"/>
-          </w:tcPr>
-          <w:p>
-            <w:r>
-              <w:rPr>
-                <w:sz w:val="18"/>
-              </w:rPr>
-              <w:t>PASS - Credential Guard actif</w:t>
-            </w:r>
-          </w:p>
-        </w:tc>
-      </w:tr>
-      <w:tr>
-        <w:tc>
-          <w:tcPr>
-            <w:tcW w:type="dxa" w:w="3324"/>
-            <w:shd w:val="clear" w:color="auto" w:fill="f2f2f2"/>
-          </w:tcPr>
-          <w:p>
-            <w:r>
-              <w:rPr>
-                <w:sz w:val="18"/>
-              </w:rPr>
-              <w:t>Scan DMZ -&gt; LAN</w:t>
-            </w:r>
-          </w:p>
-        </w:tc>
-        <w:tc>
-          <w:tcPr>
-            <w:tcW w:type="dxa" w:w="3324"/>
-            <w:shd w:val="clear" w:color="auto" w:fill="f2f2f2"/>
-          </w:tcPr>
-          <w:p>
-            <w:r>
-              <w:rPr>
-                <w:sz w:val="18"/>
-              </w:rPr>
-              <w:t>Nmap</w:t>
-            </w:r>
-          </w:p>
-        </w:tc>
-        <w:tc>
-          <w:tcPr>
-            <w:tcW w:type="dxa" w:w="3324"/>
-            <w:shd w:val="clear" w:color="auto" w:fill="f2f2f2"/>
-          </w:tcPr>
-          <w:p>
-            <w:r>
-              <w:rPr>
-                <w:sz w:val="18"/>
-              </w:rPr>
-              <w:t>PASS - pfSense bloque</w:t>
-            </w:r>
-          </w:p>
-        </w:tc>
-      </w:tr>
-      <w:tr>
-        <w:tc>
-          <w:tcPr>
-            <w:tcW w:type="dxa" w:w="3324"/>
-          </w:tcPr>
-          <w:p>
-            <w:r>
-              <w:rPr>
-                <w:sz w:val="18"/>
-              </w:rPr>
-              <w:t>Injection SQL</w:t>
-            </w:r>
-          </w:p>
-        </w:tc>
-        <w:tc>
-          <w:tcPr>
-            <w:tcW w:type="dxa" w:w="3324"/>
-          </w:tcPr>
-          <w:p>
-            <w:r>
-              <w:rPr>
-                <w:sz w:val="18"/>
-              </w:rPr>
-              <w:t>SQLMap</w:t>
-            </w:r>
-          </w:p>
-        </w:tc>
-        <w:tc>
-          <w:tcPr>
-            <w:tcW w:type="dxa" w:w="3324"/>
-          </w:tcPr>
-          <w:p>
-            <w:r>
-              <w:rPr>
-                <w:sz w:val="18"/>
-              </w:rPr>
-              <w:t>PASS - WAF HAProxy actif</w:t>
-            </w:r>
-          </w:p>
-        </w:tc>
-      </w:tr>
-      <w:tr>
-        <w:tc>
-          <w:tcPr>
-            <w:tcW w:type="dxa" w:w="3324"/>
-            <w:shd w:val="clear" w:color="auto" w:fill="f2f2f2"/>
-          </w:tcPr>
-          <w:p>
-            <w:r>
-              <w:rPr>
-                <w:sz w:val="18"/>
-              </w:rPr>
-              <w:t>Log4Shell</w:t>
-            </w:r>
-          </w:p>
-        </w:tc>
-        <w:tc>
-          <w:tcPr>
-            <w:tcW w:type="dxa" w:w="3324"/>
-            <w:shd w:val="clear" w:color="auto" w:fill="f2f2f2"/>
-          </w:tcPr>
-          <w:p>
-            <w:r>
-              <w:rPr>
-                <w:sz w:val="18"/>
-              </w:rPr>
-              <w:t>Nuclei</w:t>
-            </w:r>
-          </w:p>
-        </w:tc>
-        <w:tc>
-          <w:tcPr>
-            <w:tcW w:type="dxa" w:w="3324"/>
-            <w:shd w:val="clear" w:color="auto" w:fill="f2f2f2"/>
-          </w:tcPr>
-          <w:p>
-            <w:r>
-              <w:rPr>
-                <w:sz w:val="18"/>
-              </w:rPr>
-              <w:t>PASS - JVM mise a jour</w:t>
-            </w:r>
-          </w:p>
-        </w:tc>
-      </w:tr>
-    </w:tbl>
     <w:p>
       <w:pPr>
-        <w:spacing w:before="100" w:after="40"/>
+        <w:spacing w:before="40" w:after="60"/>
+      </w:pPr>
+      <w:r>
+        <w:rPr>
+          <w:sz w:val="22"/>
+        </w:rPr>
+        <w:t>Cinq outils open source ont été utilisés pour scanner l'ensemble de l'infrastructure et identifier les vulnérabilités existantes.</w:t>
+      </w:r>
+    </w:p>
+    <w:p>
+      <w:pPr>
+        <w:spacing w:before="20" w:after="40"/>
+        <w:ind w:left="400"/>
+      </w:pPr>
+      <w:r>
+        <w:rPr>
+          <w:sz w:val="22"/>
+        </w:rPr>
+        <w:t>–  Nmap 7.94 : scan des ports et services — 847 ports ouverts recensés.</w:t>
+      </w:r>
+    </w:p>
+    <w:p>
+      <w:pPr>
+        <w:spacing w:before="20" w:after="40"/>
+        <w:ind w:left="400"/>
+      </w:pPr>
+      <w:r>
+        <w:rPr>
+          <w:sz w:val="22"/>
+        </w:rPr>
+        <w:t>–  OpenVAS/Greenbone : recherche des CVE connues — 38 vulnérabilités dont 8 critiques.</w:t>
+      </w:r>
+    </w:p>
+    <w:p>
+      <w:pPr>
+        <w:spacing w:before="20" w:after="40"/>
+        <w:ind w:left="400"/>
+      </w:pPr>
+      <w:r>
+        <w:rPr>
+          <w:sz w:val="22"/>
+        </w:rPr>
+        <w:t>–  Lynis 3.0 : audit du durcissement Linux — score initial de 58/100.</w:t>
+      </w:r>
+    </w:p>
+    <w:p>
+      <w:pPr>
+        <w:spacing w:before="20" w:after="40"/>
+        <w:ind w:left="400"/>
+      </w:pPr>
+      <w:r>
+        <w:rPr>
+          <w:sz w:val="22"/>
+        </w:rPr>
+        <w:t>–  CIS-CAT Lite : conformité Windows CIS — score initial de 41,7 %.</w:t>
+      </w:r>
+    </w:p>
+    <w:p>
+      <w:pPr>
+        <w:spacing w:before="20" w:after="40"/>
+        <w:ind w:left="400"/>
+      </w:pPr>
+      <w:r>
+        <w:rPr>
+          <w:sz w:val="22"/>
+        </w:rPr>
+        <w:t>–  Wapiti 3.1 : failles web OWASP Top 10 — 6 failles identifiées.</w:t>
+      </w:r>
+    </w:p>
+    <w:p>
+      <w:pPr>
+        <w:spacing w:before="40" w:after="60"/>
+      </w:pPr>
+      <w:r>
+        <w:rPr>
+          <w:sz w:val="22"/>
+        </w:rPr>
+        <w:t>Les trois risques les plus critiques retenus pour correction immédiate : EternalBlue (CVSS 9.8), Log4Shell (CVSS 10.0) et Telnet Cisco (CVSS 9.1). Une matrice de risques Probabilité x Impact a permis de prioriser les actions.</w:t>
+      </w:r>
+    </w:p>
+    <w:p>
+      <w:pPr>
+        <w:spacing w:before="280" w:after="80"/>
       </w:pPr>
       <w:r>
         <w:rPr>
           <w:b/>
-          <w:color w:val="1A6E2E"/>
-          <w:sz w:val="21"/>
+          <w:sz w:val="24"/>
+          <w:u w:val="single"/>
         </w:rPr>
-        <w:t>12/12 tests reussis - PV-RP05-2026 signe le 25/03/2026</w:t>
+        <w:t>Partie 3 — Phase 2 : Pare-feu pfSense et DMZ  (~1 minute)</w:t>
       </w:r>
     </w:p>
     <w:p>
       <w:pPr>
-        <w:spacing w:before="40" w:after="40"/>
+        <w:spacing w:before="40" w:after="60"/>
       </w:pPr>
       <w:r>
         <w:rPr>
-          <w:b w:val="0"/>
-          <w:color w:val="777777"/>
-          <w:sz w:val="18"/>
+          <w:sz w:val="22"/>
         </w:rPr>
-        <w:t>(6 autres tests : Telnet Cisco, VLAN Hopping, XSS, OpenSSL, BloodHound AD, WiFi WPA3 - tous PASS)</w:t>
+        <w:t>Un pare-feu pfSense 2.7 a été déployé avec une architecture deny-all par défaut : tout le trafic est bloqué sauf ce qui est explicitement autorisé.</w:t>
       </w:r>
     </w:p>
     <w:p>
       <w:pPr>
-        <w:spacing w:before="0" w:after="0"/>
-        <w:pBdr>
-          <w:bottom w:val="single" w:sz="6" w:space="1" w:color="1a2b3c"/>
-        </w:pBdr>
+        <w:spacing w:before="20" w:after="40"/>
+        <w:ind w:left="400"/>
       </w:pPr>
+      <w:r>
+        <w:rPr>
+          <w:sz w:val="22"/>
+        </w:rPr>
+        <w:t>–  Création d'une DMZ (172.16.0.0/24) totalement isolée du LAN interne. Même si un serveur web est compromis, l'attaquant reste bloqué en DMZ et ne peut pas atteindre le réseau interne.</w:t>
+      </w:r>
     </w:p>
     <w:p>
       <w:pPr>
-        <w:spacing w:before="120" w:after="60"/>
+        <w:spacing w:before="20" w:after="40"/>
+        <w:ind w:left="400"/>
+      </w:pPr>
+      <w:r>
+        <w:rPr>
+          <w:sz w:val="22"/>
+        </w:rPr>
+        <w:t>–  Activation de l'IDS/IPS Suricata sur l'interface WAN — détection et blocage des attaques connues en temps réel (remplace Snort, plus performant car multi-thread).</w:t>
+      </w:r>
+    </w:p>
+    <w:p>
+      <w:pPr>
+        <w:spacing w:before="20" w:after="40"/>
+        <w:ind w:left="400"/>
+      </w:pPr>
+      <w:r>
+        <w:rPr>
+          <w:sz w:val="22"/>
+        </w:rPr>
+        <w:t>–  Toutes les règles de filtrage sont explicites, documentées et versionnées.</w:t>
+      </w:r>
+    </w:p>
+    <w:p>
+      <w:pPr>
+        <w:spacing w:before="280" w:after="80"/>
       </w:pPr>
       <w:r>
         <w:rPr>
           <w:b/>
-          <w:color w:val="1A2B3C"/>
           <w:sz w:val="24"/>
+          <w:u w:val="single"/>
         </w:rPr>
-        <w:t>Bilan - Avant / Apres</w:t>
+        <w:t>Partie 4 — Phase 3 : Durcissement Linux et Windows  (~1 minute)</w:t>
       </w:r>
     </w:p>
-    <w:tbl>
-      <w:tblPr>
-        <w:tblStyle w:val="TableGrid"/>
-        <w:tblW w:type="auto" w:w="0"/>
-        <w:tblLook w:firstColumn="1" w:firstRow="1" w:lastColumn="0" w:lastRow="0" w:noHBand="0" w:noVBand="1" w:val="04A0"/>
-      </w:tblPr>
-      <w:tblGrid>
-        <w:gridCol w:w="4986"/>
-        <w:gridCol w:w="4986"/>
-      </w:tblGrid>
-      <w:tr>
-        <w:tc>
-          <w:tcPr>
-            <w:tcW w:type="dxa" w:w="4986"/>
-            <w:shd w:val="clear" w:color="auto" w:fill="1a2b3c"/>
-          </w:tcPr>
-          <w:p>
-            <w:r>
-              <w:rPr>
-                <w:b/>
-                <w:color w:val="FFFFFF"/>
-                <w:sz w:val="18"/>
-              </w:rPr>
-              <w:t>AVANT</w:t>
-            </w:r>
-          </w:p>
-        </w:tc>
-        <w:tc>
-          <w:tcPr>
-            <w:tcW w:type="dxa" w:w="4986"/>
-            <w:shd w:val="clear" w:color="auto" w:fill="1a2b3c"/>
-          </w:tcPr>
-          <w:p>
-            <w:r>
-              <w:rPr>
-                <w:b/>
-                <w:color w:val="FFFFFF"/>
-                <w:sz w:val="18"/>
-              </w:rPr>
-              <w:t>APRES</w:t>
-            </w:r>
-          </w:p>
-        </w:tc>
-      </w:tr>
-      <w:tr>
-        <w:tc>
-          <w:tcPr>
-            <w:tcW w:type="dxa" w:w="4986"/>
-          </w:tcPr>
-          <w:p>
-            <w:r>
-              <w:rPr>
-                <w:sz w:val="18"/>
-              </w:rPr>
-              <w:t>8 failles critiques actives</w:t>
-            </w:r>
-          </w:p>
-        </w:tc>
-        <w:tc>
-          <w:tcPr>
-            <w:tcW w:type="dxa" w:w="4986"/>
-          </w:tcPr>
-          <w:p>
-            <w:r>
-              <w:rPr>
-                <w:sz w:val="18"/>
-              </w:rPr>
-              <w:t>0 faille critique</w:t>
-            </w:r>
-          </w:p>
-        </w:tc>
-      </w:tr>
-      <w:tr>
-        <w:tc>
-          <w:tcPr>
-            <w:tcW w:type="dxa" w:w="4986"/>
-            <w:shd w:val="clear" w:color="auto" w:fill="f2f2f2"/>
-          </w:tcPr>
-          <w:p>
-            <w:r>
-              <w:rPr>
-                <w:sz w:val="18"/>
-              </w:rPr>
-              <w:t>CIS-CAT Windows : 41,7 %</w:t>
-            </w:r>
-          </w:p>
-        </w:tc>
-        <w:tc>
-          <w:tcPr>
-            <w:tcW w:type="dxa" w:w="4986"/>
-            <w:shd w:val="clear" w:color="auto" w:fill="f2f2f2"/>
-          </w:tcPr>
-          <w:p>
-            <w:r>
-              <w:rPr>
-                <w:sz w:val="18"/>
-              </w:rPr>
-              <w:t>CIS-CAT Windows : 82 %</w:t>
-            </w:r>
-          </w:p>
-        </w:tc>
-      </w:tr>
-      <w:tr>
-        <w:tc>
-          <w:tcPr>
-            <w:tcW w:type="dxa" w:w="4986"/>
-          </w:tcPr>
-          <w:p>
-            <w:r>
-              <w:rPr>
-                <w:sz w:val="18"/>
-              </w:rPr>
-              <w:t>Lynis Linux : 58/100</w:t>
-            </w:r>
-          </w:p>
-        </w:tc>
-        <w:tc>
-          <w:tcPr>
-            <w:tcW w:type="dxa" w:w="4986"/>
-          </w:tcPr>
-          <w:p>
-            <w:r>
-              <w:rPr>
-                <w:sz w:val="18"/>
-              </w:rPr>
-              <w:t>Lynis Linux : 79/100</w:t>
-            </w:r>
-          </w:p>
-        </w:tc>
-      </w:tr>
-      <w:tr>
-        <w:tc>
-          <w:tcPr>
-            <w:tcW w:type="dxa" w:w="4986"/>
-            <w:shd w:val="clear" w:color="auto" w:fill="f2f2f2"/>
-          </w:tcPr>
-          <w:p>
-            <w:r>
-              <w:rPr>
-                <w:sz w:val="18"/>
-              </w:rPr>
-              <w:t>Aucun pare-feu, aucune DMZ</w:t>
-            </w:r>
-          </w:p>
-        </w:tc>
-        <w:tc>
-          <w:tcPr>
-            <w:tcW w:type="dxa" w:w="4986"/>
-            <w:shd w:val="clear" w:color="auto" w:fill="f2f2f2"/>
-          </w:tcPr>
-          <w:p>
-            <w:r>
-              <w:rPr>
-                <w:sz w:val="18"/>
-              </w:rPr>
-              <w:t>pfSense deny-all + DMZ + Snort IDS</w:t>
-            </w:r>
-          </w:p>
-        </w:tc>
-      </w:tr>
-    </w:tbl>
     <w:p>
       <w:pPr>
-        <w:spacing w:before="120" w:after="40"/>
+        <w:spacing w:before="40" w:after="60"/>
+      </w:pPr>
+      <w:r>
+        <w:rPr>
+          <w:sz w:val="22"/>
+        </w:rPr>
+        <w:t>Le durcissement des systèmes d'exploitation a permis d'améliorer significativement les scores de conformité.</w:t>
+      </w:r>
+    </w:p>
+    <w:p>
+      <w:pPr>
+        <w:spacing w:before="40" w:after="60"/>
+      </w:pPr>
+      <w:r>
+        <w:rPr>
+          <w:sz w:val="22"/>
+        </w:rPr>
+        <w:t>Linux — score Lynis passé de 58/100 à 79/100 (+21 points) :</w:t>
+      </w:r>
+    </w:p>
+    <w:p>
+      <w:pPr>
+        <w:spacing w:before="20" w:after="40"/>
+        <w:ind w:left="400"/>
+      </w:pPr>
+      <w:r>
+        <w:rPr>
+          <w:sz w:val="22"/>
+        </w:rPr>
+        <w:t>–  Remplacement d'UFW par nftables (firewall natif kernel Linux, plus performant et précis).</w:t>
+      </w:r>
+    </w:p>
+    <w:p>
+      <w:pPr>
+        <w:spacing w:before="20" w:after="40"/>
+        <w:ind w:left="400"/>
+      </w:pPr>
+      <w:r>
+        <w:rPr>
+          <w:sz w:val="22"/>
+        </w:rPr>
+        <w:t>–  Remplacement de Fail2ban par CrowdSec — IPS collaboratif qui bloque les IPs malveillantes connues de la communauté mondiale en plus des tentatives locales.</w:t>
+      </w:r>
+    </w:p>
+    <w:p>
+      <w:pPr>
+        <w:spacing w:before="20" w:after="40"/>
+        <w:ind w:left="400"/>
+      </w:pPr>
+      <w:r>
+        <w:rPr>
+          <w:sz w:val="22"/>
+        </w:rPr>
+        <w:t>–  SSH sécurisé : PermitRootLogin désactivé, authentification par clé uniquement.</w:t>
+      </w:r>
+    </w:p>
+    <w:p>
+      <w:pPr>
+        <w:spacing w:before="20" w:after="40"/>
+        <w:ind w:left="400"/>
+      </w:pPr>
+      <w:r>
+        <w:rPr>
+          <w:sz w:val="22"/>
+        </w:rPr>
+        <w:t>–  Auditd activé, services inutiles désactivés.</w:t>
+      </w:r>
+    </w:p>
+    <w:p>
+      <w:pPr>
+        <w:spacing w:before="40" w:after="60"/>
+      </w:pPr>
+      <w:r>
+        <w:rPr>
+          <w:sz w:val="22"/>
+        </w:rPr>
+        <w:t>Windows — score CIS-CAT passé de 41,7 % à 82 % (+40 points) :</w:t>
+      </w:r>
+    </w:p>
+    <w:p>
+      <w:pPr>
+        <w:spacing w:before="20" w:after="40"/>
+        <w:ind w:left="400"/>
+      </w:pPr>
+      <w:r>
+        <w:rPr>
+          <w:sz w:val="22"/>
+        </w:rPr>
+        <w:t>–  SMBv1 désactivé — faille EternalBlue corrigée.</w:t>
+      </w:r>
+    </w:p>
+    <w:p>
+      <w:pPr>
+        <w:spacing w:before="20" w:after="40"/>
+        <w:ind w:left="400"/>
+      </w:pPr>
+      <w:r>
+        <w:rPr>
+          <w:sz w:val="22"/>
+        </w:rPr>
+        <w:t>–  LLMNR désactivé, Credential Guard activé, LAPS déployé.</w:t>
+      </w:r>
+    </w:p>
+    <w:p>
+      <w:pPr>
+        <w:spacing w:before="20" w:after="40"/>
+        <w:ind w:left="400"/>
+      </w:pPr>
+      <w:r>
+        <w:rPr>
+          <w:sz w:val="22"/>
+        </w:rPr>
+        <w:t>–  12 GPOs ANSSI appliquées sur l'ensemble du domaine Active Directory.</w:t>
+      </w:r>
+    </w:p>
+    <w:p>
+      <w:pPr>
+        <w:spacing w:before="280" w:after="80"/>
       </w:pPr>
       <w:r>
         <w:rPr>
           <w:b/>
-          <w:color w:val="1A2B3C"/>
-          <w:sz w:val="21"/>
+          <w:sz w:val="24"/>
+          <w:u w:val="single"/>
         </w:rPr>
-        <w:t>9 livrables produits  -  Competences BTS SIO validees : B3.1 - B3.2 - B3.3</w:t>
+        <w:t>Partie 5 — Phase 4 : Tests de pénétration et bilan  (~1 minute)</w:t>
       </w:r>
     </w:p>
     <w:p>
       <w:pPr>
-        <w:spacing w:before="0" w:after="0"/>
-        <w:pBdr>
-          <w:bottom w:val="single" w:sz="6" w:space="1" w:color="1a2b3c"/>
-        </w:pBdr>
+        <w:spacing w:before="40" w:after="60"/>
       </w:pPr>
+      <w:r>
+        <w:rPr>
+          <w:sz w:val="22"/>
+        </w:rPr>
+        <w:t>12 tests de pénétration ont été réalisés avec une autorisation signée (réf. AUTH-RP05-2026-001) pour valider l'efficacité de toutes les mesures déployées.</w:t>
+      </w:r>
     </w:p>
     <w:p>
       <w:pPr>
-        <w:spacing w:before="120" w:after="60"/>
+        <w:spacing w:before="20" w:after="40"/>
+        <w:ind w:left="400"/>
+      </w:pPr>
+      <w:r>
+        <w:rPr>
+          <w:sz w:val="22"/>
+        </w:rPr>
+        <w:t>–  EternalBlue via Metasploit — PASS : SMBv1 désactivé.</w:t>
+      </w:r>
+    </w:p>
+    <w:p>
+      <w:pPr>
+        <w:spacing w:before="20" w:after="40"/>
+        <w:ind w:left="400"/>
+      </w:pPr>
+      <w:r>
+        <w:rPr>
+          <w:sz w:val="22"/>
+        </w:rPr>
+        <w:t>–  Brute force SSH via Hydra — PASS : CrowdSec bloque dès la 3e tentative.</w:t>
+      </w:r>
+    </w:p>
+    <w:p>
+      <w:pPr>
+        <w:spacing w:before="20" w:after="40"/>
+        <w:ind w:left="400"/>
+      </w:pPr>
+      <w:r>
+        <w:rPr>
+          <w:sz w:val="22"/>
+        </w:rPr>
+        <w:t>–  Pass-the-Hash via Mimikatz — PASS : Credential Guard actif.</w:t>
+      </w:r>
+    </w:p>
+    <w:p>
+      <w:pPr>
+        <w:spacing w:before="20" w:after="40"/>
+        <w:ind w:left="400"/>
+      </w:pPr>
+      <w:r>
+        <w:rPr>
+          <w:sz w:val="22"/>
+        </w:rPr>
+        <w:t>–  Scan DMZ vers LAN via Nmap — PASS : pfSense bloque la traversée.</w:t>
+      </w:r>
+    </w:p>
+    <w:p>
+      <w:pPr>
+        <w:spacing w:before="20" w:after="40"/>
+        <w:ind w:left="400"/>
+      </w:pPr>
+      <w:r>
+        <w:rPr>
+          <w:sz w:val="22"/>
+        </w:rPr>
+        <w:t>–  Injection SQL via SQLMap — PASS : WAF HAProxy actif.</w:t>
+      </w:r>
+    </w:p>
+    <w:p>
+      <w:pPr>
+        <w:spacing w:before="20" w:after="40"/>
+        <w:ind w:left="400"/>
+      </w:pPr>
+      <w:r>
+        <w:rPr>
+          <w:sz w:val="22"/>
+        </w:rPr>
+        <w:t>–  Log4Shell via Nuclei — PASS : JVM mise à jour.</w:t>
+      </w:r>
+    </w:p>
+    <w:p>
+      <w:pPr>
+        <w:spacing w:before="20" w:after="40"/>
+        <w:ind w:left="400"/>
+      </w:pPr>
+      <w:r>
+        <w:rPr>
+          <w:sz w:val="22"/>
+        </w:rPr>
+        <w:t>–  Et 6 autres tests : Telnet Cisco, VLAN Hopping, XSS, OpenSSL, BloodHound AD, WiFi WPA3. Tous PASS.</w:t>
+      </w:r>
+    </w:p>
+    <w:p>
+      <w:pPr>
+        <w:spacing w:before="40" w:after="60"/>
+      </w:pPr>
+      <w:r>
+        <w:rPr>
+          <w:sz w:val="22"/>
+        </w:rPr>
+        <w:t>Résultat global : 12/12 PASS. PV de tests signé le 25/03/2026. 9 livrables produits dans les délais.</w:t>
+      </w:r>
+    </w:p>
+    <w:p>
+      <w:pPr>
+        <w:spacing w:before="280" w:after="80"/>
       </w:pPr>
       <w:r>
         <w:rPr>
           <w:b/>
-          <w:color w:val="1A2B3C"/>
+          <w:sz w:val="24"/>
+          <w:u w:val="single"/>
+        </w:rPr>
+        <w:t>Bilan</w:t>
+      </w:r>
+    </w:p>
+    <w:p>
+      <w:pPr>
+        <w:spacing w:before="40" w:after="60"/>
+      </w:pPr>
+      <w:r>
+        <w:rPr>
           <w:sz w:val="22"/>
         </w:rPr>
-        <w:t>Guide minutage - 5 minutes</w:t>
+        <w:t>Avant la RP-05, l'infrastructure présentait 8 vulnérabilités critiques actives, aucun pare-feu dédié, aucune DMZ et des systèmes non durcis. À l'issue de cette réalisation : 0 faille critique résiduelle, CIS-CAT Windows à 82 %, Lynis Linux à 79/100, pfSense en production avec Suricata (IDS/IPS), nftables et CrowdSec déployés sur le serveur de l'école.</w:t>
       </w:r>
     </w:p>
-    <w:tbl>
-      <w:tblPr>
-        <w:tblStyle w:val="TableGrid"/>
-        <w:tblW w:type="auto" w:w="0"/>
-        <w:tblLook w:firstColumn="1" w:firstRow="1" w:lastColumn="0" w:lastRow="0" w:noHBand="0" w:noVBand="1" w:val="04A0"/>
-      </w:tblPr>
-      <w:tblGrid>
-        <w:gridCol w:w="3324"/>
-        <w:gridCol w:w="3324"/>
-        <w:gridCol w:w="3324"/>
-      </w:tblGrid>
-      <w:tr>
-        <w:tc>
-          <w:tcPr>
-            <w:tcW w:type="dxa" w:w="3324"/>
-            <w:shd w:val="clear" w:color="auto" w:fill="1a2b3c"/>
-          </w:tcPr>
-          <w:p>
-            <w:r>
-              <w:rPr>
-                <w:b/>
-                <w:color w:val="FFFFFF"/>
-                <w:sz w:val="18"/>
-              </w:rPr>
-              <w:t>Partie</w:t>
-            </w:r>
-          </w:p>
-        </w:tc>
-        <w:tc>
-          <w:tcPr>
-            <w:tcW w:type="dxa" w:w="3324"/>
-            <w:shd w:val="clear" w:color="auto" w:fill="1a2b3c"/>
-          </w:tcPr>
-          <w:p>
-            <w:r>
-              <w:rPr>
-                <w:b/>
-                <w:color w:val="FFFFFF"/>
-                <w:sz w:val="18"/>
-              </w:rPr>
-              <w:t>Contenu cle</w:t>
-            </w:r>
-          </w:p>
-        </w:tc>
-        <w:tc>
-          <w:tcPr>
-            <w:tcW w:type="dxa" w:w="3324"/>
-            <w:shd w:val="clear" w:color="auto" w:fill="1a2b3c"/>
-          </w:tcPr>
-          <w:p>
-            <w:r>
-              <w:rPr>
-                <w:b/>
-                <w:color w:val="FFFFFF"/>
-                <w:sz w:val="18"/>
-              </w:rPr>
-              <w:t>Duree</w:t>
-            </w:r>
-          </w:p>
-        </w:tc>
-      </w:tr>
-      <w:tr>
-        <w:tc>
-          <w:tcPr>
-            <w:tcW w:type="dxa" w:w="3324"/>
-          </w:tcPr>
-          <w:p>
-            <w:r>
-              <w:rPr>
-                <w:sz w:val="18"/>
-              </w:rPr>
-              <w:t>1 - Contexte</w:t>
-            </w:r>
-          </w:p>
-        </w:tc>
-        <w:tc>
-          <w:tcPr>
-            <w:tcW w:type="dxa" w:w="3324"/>
-          </w:tcPr>
-          <w:p>
-            <w:r>
-              <w:rPr>
-                <w:sz w:val="18"/>
-              </w:rPr>
-              <w:t>Infrastructure non auditee - 5 problemes critiques</w:t>
-            </w:r>
-          </w:p>
-        </w:tc>
-        <w:tc>
-          <w:tcPr>
-            <w:tcW w:type="dxa" w:w="3324"/>
-          </w:tcPr>
-          <w:p>
-            <w:r>
-              <w:rPr>
-                <w:sz w:val="18"/>
-              </w:rPr>
-              <w:t>~1 min</w:t>
-            </w:r>
-          </w:p>
-        </w:tc>
-      </w:tr>
-      <w:tr>
-        <w:tc>
-          <w:tcPr>
-            <w:tcW w:type="dxa" w:w="3324"/>
-            <w:shd w:val="clear" w:color="auto" w:fill="f2f2f2"/>
-          </w:tcPr>
-          <w:p>
-            <w:r>
-              <w:rPr>
-                <w:sz w:val="18"/>
-              </w:rPr>
-              <w:t>2 - Audit</w:t>
-            </w:r>
-          </w:p>
-        </w:tc>
-        <w:tc>
-          <w:tcPr>
-            <w:tcW w:type="dxa" w:w="3324"/>
-            <w:shd w:val="clear" w:color="auto" w:fill="f2f2f2"/>
-          </w:tcPr>
-          <w:p>
-            <w:r>
-              <w:rPr>
-                <w:sz w:val="18"/>
-              </w:rPr>
-              <w:t>5 outils - 38 CVE - matrice de risques</w:t>
-            </w:r>
-          </w:p>
-        </w:tc>
-        <w:tc>
-          <w:tcPr>
-            <w:tcW w:type="dxa" w:w="3324"/>
-            <w:shd w:val="clear" w:color="auto" w:fill="f2f2f2"/>
-          </w:tcPr>
-          <w:p>
-            <w:r>
-              <w:rPr>
-                <w:sz w:val="18"/>
-              </w:rPr>
-              <w:t>~1 min</w:t>
-            </w:r>
-          </w:p>
-        </w:tc>
-      </w:tr>
-      <w:tr>
-        <w:tc>
-          <w:tcPr>
-            <w:tcW w:type="dxa" w:w="3324"/>
-          </w:tcPr>
-          <w:p>
-            <w:r>
-              <w:rPr>
-                <w:sz w:val="18"/>
-              </w:rPr>
-              <w:t>3 - pfSense + DMZ</w:t>
-            </w:r>
-          </w:p>
-        </w:tc>
-        <w:tc>
-          <w:tcPr>
-            <w:tcW w:type="dxa" w:w="3324"/>
-          </w:tcPr>
-          <w:p>
-            <w:r>
-              <w:rPr>
-                <w:sz w:val="18"/>
-              </w:rPr>
-              <w:t>Deny-all - DMZ isolee - Snort IDS</w:t>
-            </w:r>
-          </w:p>
-        </w:tc>
-        <w:tc>
-          <w:tcPr>
-            <w:tcW w:type="dxa" w:w="3324"/>
-          </w:tcPr>
-          <w:p>
-            <w:r>
-              <w:rPr>
-                <w:sz w:val="18"/>
-              </w:rPr>
-              <w:t>~1 min</w:t>
-            </w:r>
-          </w:p>
-        </w:tc>
-      </w:tr>
-      <w:tr>
-        <w:tc>
-          <w:tcPr>
-            <w:tcW w:type="dxa" w:w="3324"/>
-            <w:shd w:val="clear" w:color="auto" w:fill="f2f2f2"/>
-          </w:tcPr>
-          <w:p>
-            <w:r>
-              <w:rPr>
-                <w:sz w:val="18"/>
-              </w:rPr>
-              <w:t>4 - Durcissement</w:t>
-            </w:r>
-          </w:p>
-        </w:tc>
-        <w:tc>
-          <w:tcPr>
-            <w:tcW w:type="dxa" w:w="3324"/>
-            <w:shd w:val="clear" w:color="auto" w:fill="f2f2f2"/>
-          </w:tcPr>
-          <w:p>
-            <w:r>
-              <w:rPr>
-                <w:sz w:val="18"/>
-              </w:rPr>
-              <w:t>Linux +21 pts - Windows +40 pts - actions concretes</w:t>
-            </w:r>
-          </w:p>
-        </w:tc>
-        <w:tc>
-          <w:tcPr>
-            <w:tcW w:type="dxa" w:w="3324"/>
-            <w:shd w:val="clear" w:color="auto" w:fill="f2f2f2"/>
-          </w:tcPr>
-          <w:p>
-            <w:r>
-              <w:rPr>
-                <w:sz w:val="18"/>
-              </w:rPr>
-              <w:t>~1 min</w:t>
-            </w:r>
-          </w:p>
-        </w:tc>
-      </w:tr>
-      <w:tr>
-        <w:tc>
-          <w:tcPr>
-            <w:tcW w:type="dxa" w:w="3324"/>
-          </w:tcPr>
-          <w:p>
-            <w:r>
-              <w:rPr>
-                <w:sz w:val="18"/>
-              </w:rPr>
-              <w:t>5 - Pentests + Bilan</w:t>
-            </w:r>
-          </w:p>
-        </w:tc>
-        <w:tc>
-          <w:tcPr>
-            <w:tcW w:type="dxa" w:w="3324"/>
-          </w:tcPr>
-          <w:p>
-            <w:r>
-              <w:rPr>
-                <w:sz w:val="18"/>
-              </w:rPr>
-              <w:t>12/12 PASS - avant/apres - competences validees</w:t>
-            </w:r>
-          </w:p>
-        </w:tc>
-        <w:tc>
-          <w:tcPr>
-            <w:tcW w:type="dxa" w:w="3324"/>
-          </w:tcPr>
-          <w:p>
-            <w:r>
-              <w:rPr>
-                <w:sz w:val="18"/>
-              </w:rPr>
-              <w:t>~1 min</w:t>
-            </w:r>
-          </w:p>
-        </w:tc>
-      </w:tr>
-    </w:tbl>
+    <w:p>
+      <w:pPr>
+        <w:spacing w:before="40" w:after="60"/>
+      </w:pPr>
+      <w:r>
+        <w:rPr>
+          <w:sz w:val="22"/>
+        </w:rPr>
+        <w:t>Compétences BTS SIO Bloc 3 validées : B3.1 — Concevoir une solution d'infrastructure réseau, B3.2 — Installer, tester et déployer, B3.3 — Exploiter, dépanner et superviser.</w:t>
+      </w:r>
+    </w:p>
     <w:p/>
     <w:p>
       <w:pPr>
@@ -1907,14 +583,14 @@
       <w:r>
         <w:rPr>
           <w:color w:val="888888"/>
-          <w:sz w:val="17"/>
+          <w:sz w:val="18"/>
         </w:rPr>
-        <w:t>ANDREO Vincent  -  BTS SIO SISR  -  IRIS Nice - Mediaschool  -  Mars 2026</w:t>
+        <w:t>ANDREO Vincent  ·  BTS SIO SISR  ·  IRIS Nice — Mediaschool  ·  Mars 2026</w:t>
       </w:r>
     </w:p>
     <w:sectPr>
       <w:pgSz w:w="12240" w:h="15840"/>
-      <w:pgMar w:top="1020" w:right="1134" w:bottom="1020" w:left="1134" w:header="720" w:footer="720" w:gutter="0"/>
+      <w:pgMar w:top="1417" w:right="1701" w:bottom="1417" w:left="1701" w:header="720" w:footer="720" w:gutter="0"/>
       <w:cols w:space="720"/>
       <w:docGrid w:linePitch="360"/>
     </w:sectPr>

</xml_diff>

<commit_message>
feat(rp05): update presentation docx + add network architecture SVG
Co-authored-by: Copilot <223556219+Copilot@users.noreply.github.com>
</commit_message>
<xml_diff>
--- a/Présentation-5min-RP05-ANDREO-Vincent.docx
+++ b/Présentation-5min-RP05-ANDREO-Vincent.docx
@@ -234,8 +234,44 @@
         <w:ind w:left="400"/>
       </w:pPr>
       <w:r>
-        <w:t>–  Toutes les règles de filtrage sont explicites, documentées et versionnées.</w:t>
+        <w:t xml:space="preserve">–  Toutes les règles de filtrage sont </w:t>
       </w:r>
+      <w:proofErr w:type="spellStart"/>
+      <w:r>
+        <w:t>explicites</w:t>
+      </w:r>
+      <w:proofErr w:type="spellEnd"/>
+      <w:r>
+        <w:t xml:space="preserve">, </w:t>
+      </w:r>
+      <w:proofErr w:type="spellStart"/>
+      <w:r>
+        <w:t>documentées</w:t>
+      </w:r>
+      <w:proofErr w:type="spellEnd"/>
+      <w:r>
+        <w:t xml:space="preserve"> et </w:t>
+      </w:r>
+      <w:proofErr w:type="spellStart"/>
+      <w:r>
+        <w:t>versionnées</w:t>
+      </w:r>
+      <w:proofErr w:type="spellEnd"/>
+      <w:r>
+        <w:t>.</w:t>
+      </w:r>
+    </w:p>
+    <w:p>
+      <w:pPr>
+        <w:spacing w:before="20" w:after="40"/>
+        <w:ind w:left="400"/>
+      </w:pPr>
+    </w:p>
+    <w:p>
+      <w:pPr>
+        <w:spacing w:before="20" w:after="40"/>
+        <w:ind w:left="400"/>
+      </w:pPr>
     </w:p>
     <w:p>
       <w:pPr>
@@ -247,6 +283,7 @@
           <w:sz w:val="24"/>
           <w:u w:val="single"/>
         </w:rPr>
+        <w:lastRenderedPageBreak/>
         <w:t>Partie 4 — Phase 3 : Durcissement Linux et Windows  (~1 minute)</w:t>
       </w:r>
     </w:p>
@@ -255,7 +292,6 @@
         <w:spacing w:before="40" w:after="60"/>
       </w:pPr>
       <w:r>
-        <w:lastRenderedPageBreak/>
         <w:t>Le durcissement des systèmes d'exploitation a permis d'améliorer significativement les scores de conformité.</w:t>
       </w:r>
     </w:p>

</xml_diff>